<commit_message>
Regen offer: make list styled like the T&C table, exclusions on its own page
- MAKE LIST takes the Terms & Conditions design: shaded ITEMS column, single
  border on every cell. Its rows are rebuilt on each generation, so the styling
  is applied in fill_make_list rather than baked into the template.
- Page break before EXCLUSIONS, so it starts its own page instead of trailing
  the electrical panel section and splitting mid-table.
- The rule moves from under the Fig 1 diagram to directly under the Fig 1
  heading, where it reads as part of that heading rather than looking like it
  belongs to Fig 2.

Co-Authored-By: Claude Opus 5 (1M context) <noreply@anthropic.com>
</commit_message>
<xml_diff>
--- a/Regen_Dual_Offer_Template.docx
+++ b/Regen_Dual_Offer_Template.docx
@@ -1184,6 +1184,9 @@
         <w:keepNext/>
         <w:keepLines/>
         <w:jc w:val="center"/>
+        <w:pBdr>
+          <w:bottom w:val="single" w:sz="6" w:space="6" w:color="808080"/>
+        </w:pBdr>
       </w:pPr>
       <w:r>
         <w:rPr>
@@ -6121,6 +6124,7 @@
           <w:szCs w:val="24"/>
           <w:u w:val="single"/>
         </w:rPr>
+        <w:pageBreakBefore/>
       </w:pPr>
       <w:r>
         <w:rPr>

</xml_diff>

<commit_message>
Regen offer: actually strip the rule around Fig 1
The previous commit deleted the helper that DREW the rule, but that same helper
was what cleared any existing one — and the rule had already been committed
into the templates, so it survived. The patch now explicitly removes paragraph
borders from the figure captions and the diagram paragraphs.

Verified in the Word render: 0 paragraph borders in all three templates, and
p3 runs TECHNICAL OFFER -> REGENERATIVE BURNERS -> body -> Fig 1 + diagram with
nothing after it.

Co-Authored-By: Claude Opus 5 (1M context) <noreply@anthropic.com>
</commit_message>
<xml_diff>
--- a/Regen_Dual_Offer_Template.docx
+++ b/Regen_Dual_Offer_Template.docx
@@ -1184,9 +1184,6 @@
         <w:keepNext/>
         <w:keepLines/>
         <w:jc w:val="center"/>
-        <w:pBdr>
-          <w:bottom w:val="single" w:sz="6" w:space="6" w:color="808080"/>
-        </w:pBdr>
       </w:pPr>
       <w:r>
         <w:rPr>
@@ -1202,9 +1199,6 @@
         <w:jc w:val="center"/>
         <w:keepNext/>
         <w:keepLines/>
-        <w:pBdr>
-          <w:bottom w:val="single" w:sz="6" w:space="6" w:color="808080"/>
-        </w:pBdr>
       </w:pPr>
       <w:r>
         <w:rPr>

</xml_diff>